<commit_message>
chore: update BCDXGN KHCN template with UNC loop
</commit_message>
<xml_diff>
--- a/report_assets/KHCN templates/Hợp đồng tín dụng/2268.07 BCDXGN kiem GNN han muc SXKD.docx
+++ b/report_assets/KHCN templates/Hợp đồng tín dụng/2268.07 BCDXGN kiem GNN han muc SXKD.docx
@@ -152,7 +152,7 @@
           </mc:Choice>
           <mc:Fallback>
             <w:pict>
-              <v:line w14:anchorId="12D72D0D" id="Straight Connector 1" o:spid="_x0000_s1026" style="position:absolute;z-index:251659264;visibility:visible;mso-wrap-style:square;mso-width-percent:0;mso-height-percent:0;mso-wrap-distance-left:9pt;mso-wrap-distance-top:-3e-5mm;mso-wrap-distance-right:9pt;mso-wrap-distance-bottom:-3e-5mm;mso-position-horizontal:center;mso-position-horizontal-relative:margin;mso-position-vertical:absolute;mso-position-vertical-relative:text;mso-width-percent:0;mso-height-percent:0;mso-width-relative:page;mso-height-relative:page" from="0,2.3pt" to="148.5pt,2.3pt" o:gfxdata="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" strokecolor="black [3040]">
+              <v:line w14:anchorId="3B522D0E" id="Straight Connector 1" o:spid="_x0000_s1026" style="position:absolute;z-index:251659264;visibility:visible;mso-wrap-style:square;mso-width-percent:0;mso-height-percent:0;mso-wrap-distance-left:9pt;mso-wrap-distance-top:-3e-5mm;mso-wrap-distance-right:9pt;mso-wrap-distance-bottom:-3e-5mm;mso-position-horizontal:center;mso-position-horizontal-relative:margin;mso-position-vertical:absolute;mso-position-vertical-relative:text;mso-width-percent:0;mso-height-percent:0;mso-width-relative:page;mso-height-relative:page" from="0,2.3pt" to="148.5pt,2.3pt" o:gfxdata="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" strokecolor="black [3040]">
                 <o:lock v:ext="edit" shapetype="f"/>
                 <w10:wrap anchorx="margin"/>
               </v:line>
@@ -3027,192 +3027,135 @@
         </w:rPr>
         <w:t>:</w:t>
       </w:r>
-    </w:p>
-    <w:tbl>
-      <w:tblPr>
-        <w:tblStyle w:val="TableGrid21"/>
-        <w:tblW w:w="5305" w:type="pct"/>
-        <w:tblInd w:w="-601" w:type="dxa"/>
-        <w:tblBorders>
-          <w:top w:val="none" w:sz="0" w:space="0" w:color="auto"/>
-          <w:left w:val="none" w:sz="0" w:space="0" w:color="auto"/>
-          <w:bottom w:val="none" w:sz="0" w:space="0" w:color="auto"/>
-          <w:right w:val="none" w:sz="0" w:space="0" w:color="auto"/>
-          <w:insideH w:val="none" w:sz="0" w:space="0" w:color="auto"/>
-          <w:insideV w:val="none" w:sz="0" w:space="0" w:color="auto"/>
-        </w:tblBorders>
-        <w:tblLayout w:type="fixed"/>
-        <w:tblLook w:val="04A0" w:firstRow="1" w:lastRow="0" w:firstColumn="1" w:lastColumn="0" w:noHBand="0" w:noVBand="1"/>
-      </w:tblPr>
-      <w:tblGrid>
-        <w:gridCol w:w="598"/>
-        <w:gridCol w:w="9857"/>
-      </w:tblGrid>
-      <w:tr>
-        <w:tc>
-          <w:tcPr>
-            <w:tcW w:w="286" w:type="pct"/>
-          </w:tcPr>
-          <w:p>
-            <w:pPr>
-              <w:suppressAutoHyphens/>
-              <w:spacing w:line="276" w:lineRule="auto"/>
-              <w:jc w:val="both"/>
-              <w:rPr>
-                <w:color w:val="FFFFFF" w:themeColor="background1"/>
-                <w:sz w:val="18"/>
-                <w:szCs w:val="18"/>
-                <w:vertAlign w:val="subscript"/>
-                <w:lang w:val="nl-NL" w:eastAsia="en-US"/>
-              </w:rPr>
-            </w:pPr>
-          </w:p>
-        </w:tc>
-        <w:tc>
-          <w:tcPr>
-            <w:tcW w:w="4714" w:type="pct"/>
-          </w:tcPr>
-          <w:p>
-            <w:pPr>
-              <w:suppressAutoHyphens/>
-              <w:spacing w:line="276" w:lineRule="auto"/>
-              <w:ind w:firstLine="563"/>
-              <w:contextualSpacing/>
-              <w:jc w:val="both"/>
-              <w:rPr>
-                <w:sz w:val="26"/>
-                <w:szCs w:val="26"/>
-                <w:lang w:val="nl-NL" w:eastAsia="en-US"/>
-              </w:rPr>
-            </w:pPr>
-            <w:r>
-              <w:rPr>
-                <w:sz w:val="26"/>
-                <w:szCs w:val="26"/>
-                <w:lang w:val="nl-NL" w:eastAsia="en-US"/>
-              </w:rPr>
-              <w:t>-</w:t>
-            </w:r>
-            <w:r>
-              <w:rPr>
-                <w:sz w:val="26"/>
-                <w:szCs w:val="26"/>
-                <w:lang w:val="nl-NL" w:eastAsia="en-US"/>
-              </w:rPr>
-              <w:t xml:space="preserve"> Tiền mặt: </w:t>
-            </w:r>
-            <w:r>
-              <w:rPr>
-                <w:b/>
-                <w:sz w:val="26"/>
-                <w:szCs w:val="26"/>
-                <w:lang w:val="nl-NL" w:eastAsia="en-US"/>
-              </w:rPr>
-              <w:t>[GN.Tiền mặt]</w:t>
-            </w:r>
-            <w:r>
-              <w:rPr>
-                <w:sz w:val="26"/>
-                <w:szCs w:val="26"/>
-                <w:lang w:val="nl-NL" w:eastAsia="en-US"/>
-              </w:rPr>
-              <w:t xml:space="preserve"> đồng</w:t>
-            </w:r>
-          </w:p>
-        </w:tc>
-      </w:tr>
-      <w:tr>
-        <w:tc>
-          <w:tcPr>
-            <w:tcW w:w="286" w:type="pct"/>
-          </w:tcPr>
-          <w:p>
-            <w:pPr>
-              <w:suppressAutoHyphens/>
-              <w:spacing w:line="276" w:lineRule="auto"/>
-              <w:jc w:val="both"/>
-              <w:rPr>
-                <w:color w:val="FFFFFF" w:themeColor="background1"/>
-                <w:sz w:val="18"/>
-                <w:szCs w:val="18"/>
-                <w:vertAlign w:val="subscript"/>
-                <w:lang w:val="nl-NL" w:eastAsia="en-US"/>
-              </w:rPr>
-            </w:pPr>
-            <w:r>
-              <w:rPr>
-                <w:color w:val="FFFFFF" w:themeColor="background1"/>
-                <w:sz w:val="18"/>
-                <w:szCs w:val="18"/>
-                <w:vertAlign w:val="subscript"/>
-                <w:lang w:val="nl-NL" w:eastAsia="en-US"/>
-              </w:rPr>
-              <w:t>[UNC.STT]</w:t>
-            </w:r>
-          </w:p>
-        </w:tc>
-        <w:tc>
-          <w:tcPr>
-            <w:tcW w:w="4714" w:type="pct"/>
-          </w:tcPr>
-          <w:p>
-            <w:pPr>
-              <w:suppressAutoHyphens/>
-              <w:spacing w:line="276" w:lineRule="auto"/>
-              <w:ind w:firstLine="563"/>
-              <w:contextualSpacing/>
-              <w:jc w:val="both"/>
-              <w:rPr>
-                <w:sz w:val="26"/>
-                <w:szCs w:val="26"/>
-                <w:lang w:val="nl-NL" w:eastAsia="en-US"/>
-              </w:rPr>
-            </w:pPr>
-            <w:r>
-              <w:rPr>
-                <w:sz w:val="26"/>
-                <w:szCs w:val="26"/>
-                <w:lang w:val="nl-NL" w:eastAsia="en-US"/>
-              </w:rPr>
-              <w:t>-</w:t>
-            </w:r>
-            <w:r>
-              <w:rPr>
-                <w:sz w:val="26"/>
-                <w:szCs w:val="26"/>
-                <w:lang w:val="nl-NL" w:eastAsia="en-US"/>
-              </w:rPr>
-              <w:t xml:space="preserve"> </w:t>
-            </w:r>
-            <w:r>
-              <w:rPr>
-                <w:sz w:val="26"/>
-                <w:szCs w:val="26"/>
-                <w:lang w:val="nl-NL" w:eastAsia="en-US"/>
-              </w:rPr>
-              <w:t xml:space="preserve">Chuyển khoản: </w:t>
-            </w:r>
-            <w:r>
-              <w:rPr>
-                <w:b/>
-                <w:sz w:val="26"/>
-                <w:szCs w:val="26"/>
-                <w:lang w:val="nl-NL" w:eastAsia="en-US"/>
-              </w:rPr>
-              <w:t>[UNC.Số tiền]</w:t>
-            </w:r>
-            <w:r>
-              <w:rPr>
-                <w:sz w:val="26"/>
-                <w:szCs w:val="26"/>
-                <w:lang w:val="nl-NL" w:eastAsia="en-US"/>
-              </w:rPr>
-              <w:t xml:space="preserve"> đồng. Bên thụ hưởng: [UNC.Khách hàng thụ hưởng], số tài khoản: [UNC.Số tài khoản] mở tại [UNC.Nơi mở tài khoản]</w:t>
-            </w:r>
-          </w:p>
-        </w:tc>
-      </w:tr>
-    </w:tbl>
+      <w:r>
+        <w:rPr>
+          <w:sz w:val="26"/>
+          <w:szCs w:val="26"/>
+          <w:lang w:val="en-US"/>
+        </w:rPr>
+        <w:t xml:space="preserve"> chuyển khoản:</w:t>
+      </w:r>
+    </w:p>
+    <w:p>
+      <w:pPr>
+        <w:spacing w:line="276" w:lineRule="auto"/>
+        <w:ind w:firstLine="567"/>
+        <w:jc w:val="both"/>
+        <w:rPr>
+          <w:sz w:val="26"/>
+          <w:szCs w:val="26"/>
+          <w:lang w:val="en-US"/>
+        </w:rPr>
+      </w:pPr>
+      <w:r>
+        <w:rPr>
+          <w:sz w:val="26"/>
+          <w:szCs w:val="26"/>
+          <w:lang w:val="en-US"/>
+        </w:rPr>
+        <w:t>[#UNC]</w:t>
+      </w:r>
+    </w:p>
+    <w:p>
+      <w:pPr>
+        <w:spacing w:line="276" w:lineRule="auto"/>
+        <w:ind w:firstLine="567"/>
+        <w:jc w:val="both"/>
+        <w:rPr>
+          <w:sz w:val="26"/>
+          <w:szCs w:val="26"/>
+          <w:lang w:val="en-US"/>
+        </w:rPr>
+      </w:pPr>
+      <w:r>
+        <w:rPr>
+          <w:sz w:val="26"/>
+          <w:szCs w:val="26"/>
+          <w:lang w:val="en-US"/>
+        </w:rPr>
+        <w:t xml:space="preserve">- Người thụ hưởng: </w:t>
+      </w:r>
+      <w:r>
+        <w:rPr>
+          <w:sz w:val="26"/>
+          <w:szCs w:val="26"/>
+        </w:rPr>
+        <w:t>[Khách hàng thụ hưởng]</w:t>
+      </w:r>
+      <w:r>
+        <w:rPr>
+          <w:sz w:val="26"/>
+          <w:szCs w:val="26"/>
+          <w:lang w:val="en-US"/>
+        </w:rPr>
+        <w:t xml:space="preserve">, số tài khoản: </w:t>
+      </w:r>
+      <w:r>
+        <w:rPr>
+          <w:sz w:val="26"/>
+          <w:szCs w:val="26"/>
+        </w:rPr>
+        <w:t>[Số tài khoản]</w:t>
+      </w:r>
+      <w:r>
+        <w:rPr>
+          <w:sz w:val="26"/>
+          <w:szCs w:val="26"/>
+          <w:lang w:val="en-US"/>
+        </w:rPr>
+        <w:t xml:space="preserve"> tại </w:t>
+      </w:r>
+      <w:r>
+        <w:rPr>
+          <w:sz w:val="26"/>
+          <w:szCs w:val="26"/>
+        </w:rPr>
+        <w:t>[Nơi mở tài khoản]</w:t>
+      </w:r>
+      <w:r>
+        <w:rPr>
+          <w:sz w:val="26"/>
+          <w:szCs w:val="26"/>
+          <w:lang w:val="en-US"/>
+        </w:rPr>
+        <w:t xml:space="preserve">, số tiền giải ngân là </w:t>
+      </w:r>
+      <w:r>
+        <w:rPr>
+          <w:sz w:val="26"/>
+          <w:szCs w:val="26"/>
+        </w:rPr>
+        <w:t>[Số tiền]</w:t>
+      </w:r>
+      <w:r>
+        <w:rPr>
+          <w:sz w:val="26"/>
+          <w:szCs w:val="26"/>
+          <w:lang w:val="en-US"/>
+        </w:rPr>
+        <w:t xml:space="preserve"> đồng</w:t>
+      </w:r>
+    </w:p>
+    <w:p>
+      <w:pPr>
+        <w:spacing w:line="276" w:lineRule="auto"/>
+        <w:ind w:firstLine="567"/>
+        <w:jc w:val="both"/>
+        <w:rPr>
+          <w:sz w:val="26"/>
+          <w:szCs w:val="26"/>
+          <w:lang w:val="en-US"/>
+        </w:rPr>
+      </w:pPr>
+      <w:r>
+        <w:rPr>
+          <w:sz w:val="26"/>
+          <w:szCs w:val="26"/>
+          <w:lang w:val="en-US"/>
+        </w:rPr>
+        <w:t>[/UNC]</w:t>
+      </w:r>
+    </w:p>
     <w:p>
       <w:pPr>
         <w:spacing w:line="276" w:lineRule="auto"/>
@@ -4527,7 +4470,7 @@
     <w:lsdException w:name="Table Web 2" w:semiHidden="1" w:unhideWhenUsed="1"/>
     <w:lsdException w:name="Table Web 3" w:semiHidden="1" w:unhideWhenUsed="1"/>
     <w:lsdException w:name="Balloon Text" w:semiHidden="1" w:unhideWhenUsed="1"/>
-    <w:lsdException w:name="Table Grid" w:locked="1" w:uiPriority="0"/>
+    <w:lsdException w:name="Table Grid" w:locked="1" w:uiPriority="59"/>
     <w:lsdException w:name="Table Theme" w:semiHidden="1" w:unhideWhenUsed="1"/>
     <w:lsdException w:name="Placeholder Text" w:semiHidden="1"/>
     <w:lsdException w:name="No Spacing" w:uiPriority="1" w:qFormat="1"/>
@@ -4836,6 +4779,7 @@
   <w:style w:type="table" w:styleId="TableGrid">
     <w:name w:val="Table Grid"/>
     <w:basedOn w:val="TableNormal"/>
+    <w:uiPriority w:val="59"/>
     <w:locked/>
     <w:rsid w:val="00CF15B5"/>
     <w:tblPr>

</xml_diff>